<commit_message>
Add narrated demo video, fix flow screenshot caption, refresh PDF
Co-Authored-By: Claude Sonnet 5.5 <noreply@anthropic.com>
</commit_message>
<xml_diff>
--- a/docs/SwiftShip_Tracker_Project_Report.docx
+++ b/docs/SwiftShip_Tracker_Project_Report.docx
@@ -23,7 +23,7 @@
           <w:sz w:val="22"/>
           <w:szCs w:val="22"/>
         </w:rPr>
-        <w:t xml:space="preserve">Salesforce Developer project | Submitted by: Praveen P | Submission deadline: Saturday, 3 October 2026</w:t>
+        <w:t xml:space="preserve">Salesforce Developer project | Team lead: Praveen P | Submission deadline: Saturday, 3 October 2026</w:t>
       </w:r>
     </w:p>
     <w:p>
@@ -5456,7 +5456,7 @@
                 <w:sz w:val="20"/>
                 <w:szCs w:val="20"/>
               </w:rPr>
-              <w:t xml:space="preserve">Member1</w:t>
+              <w:t xml:space="preserve">Praveen P</w:t>
             </w:r>
           </w:p>
         </w:tc>
@@ -5635,7 +5635,7 @@
                 <w:sz w:val="20"/>
                 <w:szCs w:val="20"/>
               </w:rPr>
-              <w:t xml:space="preserve">Member2</w:t>
+              <w:t xml:space="preserve">Priyan K</w:t>
             </w:r>
           </w:p>
         </w:tc>
@@ -5814,7 +5814,7 @@
                 <w:sz w:val="20"/>
                 <w:szCs w:val="20"/>
               </w:rPr>
-              <w:t xml:space="preserve">Member3</w:t>
+              <w:t xml:space="preserve">Nishanth S</w:t>
             </w:r>
           </w:p>
         </w:tc>
@@ -5993,7 +5993,7 @@
                 <w:sz w:val="20"/>
                 <w:szCs w:val="20"/>
               </w:rPr>
-              <w:t xml:space="preserve">Member4</w:t>
+              <w:t xml:space="preserve">Nandhakumar A</w:t>
             </w:r>
           </w:p>
         </w:tc>
@@ -6172,7 +6172,7 @@
                 <w:sz w:val="20"/>
                 <w:szCs w:val="20"/>
               </w:rPr>
-              <w:t xml:space="preserve">Member4</w:t>
+              <w:t xml:space="preserve">Nandhakumar A</w:t>
             </w:r>
           </w:p>
         </w:tc>
@@ -6351,7 +6351,7 @@
                 <w:sz w:val="20"/>
                 <w:szCs w:val="20"/>
               </w:rPr>
-              <w:t xml:space="preserve">Member1</w:t>
+              <w:t xml:space="preserve">Praveen P</w:t>
             </w:r>
           </w:p>
         </w:tc>
@@ -6530,7 +6530,7 @@
                 <w:sz w:val="20"/>
                 <w:szCs w:val="20"/>
               </w:rPr>
-              <w:t xml:space="preserve">Member2</w:t>
+              <w:t xml:space="preserve">Priyan K</w:t>
             </w:r>
           </w:p>
         </w:tc>
@@ -6709,7 +6709,7 @@
                 <w:sz w:val="20"/>
                 <w:szCs w:val="20"/>
               </w:rPr>
-              <w:t xml:space="preserve">Member3</w:t>
+              <w:t xml:space="preserve">Nishanth S</w:t>
             </w:r>
           </w:p>
         </w:tc>
@@ -6888,7 +6888,7 @@
                 <w:sz w:val="20"/>
                 <w:szCs w:val="20"/>
               </w:rPr>
-              <w:t xml:space="preserve">Member4</w:t>
+              <w:t xml:space="preserve">Nandhakumar A</w:t>
             </w:r>
           </w:p>
         </w:tc>
@@ -8437,36 +8437,407 @@
         <w:t xml:space="preserve">Team</w:t>
       </w:r>
     </w:p>
+    <w:tbl>
+      <w:tblPr>
+        <w:tblW w:type="dxa" w:w="9638"/>
+        <w:tblBorders>
+          <w:top w:val="single" w:color="auto" w:sz="4"/>
+          <w:left w:val="single" w:color="auto" w:sz="4"/>
+          <w:bottom w:val="single" w:color="auto" w:sz="4"/>
+          <w:right w:val="single" w:color="auto" w:sz="4"/>
+          <w:insideH w:val="single" w:color="auto" w:sz="4"/>
+          <w:insideV w:val="single" w:color="auto" w:sz="4"/>
+        </w:tblBorders>
+      </w:tblPr>
+      <w:tblGrid>
+        <w:gridCol w:w="4819"/>
+        <w:gridCol w:w="4819"/>
+      </w:tblGrid>
+      <w:tr>
+        <w:trPr>
+          <w:tblHeader/>
+        </w:trPr>
+        <w:tc>
+          <w:tcPr>
+            <w:tcW w:type="dxa" w:w="4819"/>
+            <w:tcBorders>
+              <w:top w:val="single" w:color="BFBFBF" w:sz="4"/>
+              <w:left w:val="single" w:color="BFBFBF" w:sz="4"/>
+              <w:bottom w:val="single" w:color="BFBFBF" w:sz="4"/>
+              <w:right w:val="single" w:color="BFBFBF" w:sz="4"/>
+            </w:tcBorders>
+            <w:shd w:fill="DCE9F7" w:color="auto" w:val="clear"/>
+            <w:tcMar>
+              <w:top w:type="dxa" w:w="60"/>
+              <w:left w:type="dxa" w:w="100"/>
+              <w:bottom w:type="dxa" w:w="60"/>
+              <w:right w:type="dxa" w:w="100"/>
+            </w:tcMar>
+          </w:tcPr>
+          <w:p>
+            <w:r>
+              <w:rPr>
+                <w:rFonts w:ascii="Calibri" w:cs="Calibri" w:eastAsia="Calibri" w:hAnsi="Calibri"/>
+                <w:b/>
+                <w:bCs/>
+                <w:sz w:val="20"/>
+                <w:szCs w:val="20"/>
+              </w:rPr>
+              <w:t xml:space="preserve">Name</w:t>
+            </w:r>
+          </w:p>
+        </w:tc>
+        <w:tc>
+          <w:tcPr>
+            <w:tcW w:type="dxa" w:w="4819"/>
+            <w:tcBorders>
+              <w:top w:val="single" w:color="BFBFBF" w:sz="4"/>
+              <w:left w:val="single" w:color="BFBFBF" w:sz="4"/>
+              <w:bottom w:val="single" w:color="BFBFBF" w:sz="4"/>
+              <w:right w:val="single" w:color="BFBFBF" w:sz="4"/>
+            </w:tcBorders>
+            <w:shd w:fill="DCE9F7" w:color="auto" w:val="clear"/>
+            <w:tcMar>
+              <w:top w:type="dxa" w:w="60"/>
+              <w:left w:type="dxa" w:w="100"/>
+              <w:bottom w:type="dxa" w:w="60"/>
+              <w:right w:type="dxa" w:w="100"/>
+            </w:tcMar>
+          </w:tcPr>
+          <w:p>
+            <w:r>
+              <w:rPr>
+                <w:rFonts w:ascii="Calibri" w:cs="Calibri" w:eastAsia="Calibri" w:hAnsi="Calibri"/>
+                <w:b/>
+                <w:bCs/>
+                <w:sz w:val="20"/>
+                <w:szCs w:val="20"/>
+              </w:rPr>
+              <w:t xml:space="preserve">Role</w:t>
+            </w:r>
+          </w:p>
+        </w:tc>
+      </w:tr>
+      <w:tr>
+        <w:trPr>
+          <w:tblHeader w:val="off"/>
+        </w:trPr>
+        <w:tc>
+          <w:tcPr>
+            <w:tcW w:type="dxa" w:w="4819"/>
+            <w:tcBorders>
+              <w:top w:val="single" w:color="BFBFBF" w:sz="4"/>
+              <w:left w:val="single" w:color="BFBFBF" w:sz="4"/>
+              <w:bottom w:val="single" w:color="BFBFBF" w:sz="4"/>
+              <w:right w:val="single" w:color="BFBFBF" w:sz="4"/>
+            </w:tcBorders>
+            <w:tcMar>
+              <w:top w:type="dxa" w:w="60"/>
+              <w:left w:type="dxa" w:w="100"/>
+              <w:bottom w:type="dxa" w:w="60"/>
+              <w:right w:type="dxa" w:w="100"/>
+            </w:tcMar>
+          </w:tcPr>
+          <w:p>
+            <w:r>
+              <w:rPr>
+                <w:rFonts w:ascii="Calibri" w:cs="Calibri" w:eastAsia="Calibri" w:hAnsi="Calibri"/>
+                <w:b w:val="false"/>
+                <w:bCs w:val="false"/>
+                <w:sz w:val="20"/>
+                <w:szCs w:val="20"/>
+              </w:rPr>
+              <w:t xml:space="preserve">Praveen P</w:t>
+            </w:r>
+          </w:p>
+        </w:tc>
+        <w:tc>
+          <w:tcPr>
+            <w:tcW w:type="dxa" w:w="4819"/>
+            <w:tcBorders>
+              <w:top w:val="single" w:color="BFBFBF" w:sz="4"/>
+              <w:left w:val="single" w:color="BFBFBF" w:sz="4"/>
+              <w:bottom w:val="single" w:color="BFBFBF" w:sz="4"/>
+              <w:right w:val="single" w:color="BFBFBF" w:sz="4"/>
+            </w:tcBorders>
+            <w:tcMar>
+              <w:top w:type="dxa" w:w="60"/>
+              <w:left w:type="dxa" w:w="100"/>
+              <w:bottom w:type="dxa" w:w="60"/>
+              <w:right w:type="dxa" w:w="100"/>
+            </w:tcMar>
+          </w:tcPr>
+          <w:p>
+            <w:r>
+              <w:rPr>
+                <w:rFonts w:ascii="Calibri" w:cs="Calibri" w:eastAsia="Calibri" w:hAnsi="Calibri"/>
+                <w:b w:val="false"/>
+                <w:bCs w:val="false"/>
+                <w:sz w:val="20"/>
+                <w:szCs w:val="20"/>
+              </w:rPr>
+              <w:t xml:space="preserve">Team Lead (Member1 in the backlog above)</w:t>
+            </w:r>
+          </w:p>
+        </w:tc>
+      </w:tr>
+      <w:tr>
+        <w:trPr>
+          <w:tblHeader w:val="off"/>
+        </w:trPr>
+        <w:tc>
+          <w:tcPr>
+            <w:tcW w:type="dxa" w:w="4819"/>
+            <w:tcBorders>
+              <w:top w:val="single" w:color="BFBFBF" w:sz="4"/>
+              <w:left w:val="single" w:color="BFBFBF" w:sz="4"/>
+              <w:bottom w:val="single" w:color="BFBFBF" w:sz="4"/>
+              <w:right w:val="single" w:color="BFBFBF" w:sz="4"/>
+            </w:tcBorders>
+            <w:tcMar>
+              <w:top w:type="dxa" w:w="60"/>
+              <w:left w:type="dxa" w:w="100"/>
+              <w:bottom w:type="dxa" w:w="60"/>
+              <w:right w:type="dxa" w:w="100"/>
+            </w:tcMar>
+          </w:tcPr>
+          <w:p>
+            <w:r>
+              <w:rPr>
+                <w:rFonts w:ascii="Calibri" w:cs="Calibri" w:eastAsia="Calibri" w:hAnsi="Calibri"/>
+                <w:b w:val="false"/>
+                <w:bCs w:val="false"/>
+                <w:sz w:val="20"/>
+                <w:szCs w:val="20"/>
+              </w:rPr>
+              <w:t xml:space="preserve">Priyan K</w:t>
+            </w:r>
+          </w:p>
+        </w:tc>
+        <w:tc>
+          <w:tcPr>
+            <w:tcW w:type="dxa" w:w="4819"/>
+            <w:tcBorders>
+              <w:top w:val="single" w:color="BFBFBF" w:sz="4"/>
+              <w:left w:val="single" w:color="BFBFBF" w:sz="4"/>
+              <w:bottom w:val="single" w:color="BFBFBF" w:sz="4"/>
+              <w:right w:val="single" w:color="BFBFBF" w:sz="4"/>
+            </w:tcBorders>
+            <w:tcMar>
+              <w:top w:type="dxa" w:w="60"/>
+              <w:left w:type="dxa" w:w="100"/>
+              <w:bottom w:type="dxa" w:w="60"/>
+              <w:right w:type="dxa" w:w="100"/>
+            </w:tcMar>
+          </w:tcPr>
+          <w:p>
+            <w:r>
+              <w:rPr>
+                <w:rFonts w:ascii="Calibri" w:cs="Calibri" w:eastAsia="Calibri" w:hAnsi="Calibri"/>
+                <w:b w:val="false"/>
+                <w:bCs w:val="false"/>
+                <w:sz w:val="20"/>
+                <w:szCs w:val="20"/>
+              </w:rPr>
+              <w:t xml:space="preserve">Team Member (Member2)</w:t>
+            </w:r>
+          </w:p>
+        </w:tc>
+      </w:tr>
+      <w:tr>
+        <w:trPr>
+          <w:tblHeader w:val="off"/>
+        </w:trPr>
+        <w:tc>
+          <w:tcPr>
+            <w:tcW w:type="dxa" w:w="4819"/>
+            <w:tcBorders>
+              <w:top w:val="single" w:color="BFBFBF" w:sz="4"/>
+              <w:left w:val="single" w:color="BFBFBF" w:sz="4"/>
+              <w:bottom w:val="single" w:color="BFBFBF" w:sz="4"/>
+              <w:right w:val="single" w:color="BFBFBF" w:sz="4"/>
+            </w:tcBorders>
+            <w:tcMar>
+              <w:top w:type="dxa" w:w="60"/>
+              <w:left w:type="dxa" w:w="100"/>
+              <w:bottom w:type="dxa" w:w="60"/>
+              <w:right w:type="dxa" w:w="100"/>
+            </w:tcMar>
+          </w:tcPr>
+          <w:p>
+            <w:r>
+              <w:rPr>
+                <w:rFonts w:ascii="Calibri" w:cs="Calibri" w:eastAsia="Calibri" w:hAnsi="Calibri"/>
+                <w:b w:val="false"/>
+                <w:bCs w:val="false"/>
+                <w:sz w:val="20"/>
+                <w:szCs w:val="20"/>
+              </w:rPr>
+              <w:t xml:space="preserve">Nishanth S</w:t>
+            </w:r>
+          </w:p>
+        </w:tc>
+        <w:tc>
+          <w:tcPr>
+            <w:tcW w:type="dxa" w:w="4819"/>
+            <w:tcBorders>
+              <w:top w:val="single" w:color="BFBFBF" w:sz="4"/>
+              <w:left w:val="single" w:color="BFBFBF" w:sz="4"/>
+              <w:bottom w:val="single" w:color="BFBFBF" w:sz="4"/>
+              <w:right w:val="single" w:color="BFBFBF" w:sz="4"/>
+            </w:tcBorders>
+            <w:tcMar>
+              <w:top w:type="dxa" w:w="60"/>
+              <w:left w:type="dxa" w:w="100"/>
+              <w:bottom w:type="dxa" w:w="60"/>
+              <w:right w:type="dxa" w:w="100"/>
+            </w:tcMar>
+          </w:tcPr>
+          <w:p>
+            <w:r>
+              <w:rPr>
+                <w:rFonts w:ascii="Calibri" w:cs="Calibri" w:eastAsia="Calibri" w:hAnsi="Calibri"/>
+                <w:b w:val="false"/>
+                <w:bCs w:val="false"/>
+                <w:sz w:val="20"/>
+                <w:szCs w:val="20"/>
+              </w:rPr>
+              <w:t xml:space="preserve">Team Member (Member3)</w:t>
+            </w:r>
+          </w:p>
+        </w:tc>
+      </w:tr>
+      <w:tr>
+        <w:trPr>
+          <w:tblHeader w:val="off"/>
+        </w:trPr>
+        <w:tc>
+          <w:tcPr>
+            <w:tcW w:type="dxa" w:w="4819"/>
+            <w:tcBorders>
+              <w:top w:val="single" w:color="BFBFBF" w:sz="4"/>
+              <w:left w:val="single" w:color="BFBFBF" w:sz="4"/>
+              <w:bottom w:val="single" w:color="BFBFBF" w:sz="4"/>
+              <w:right w:val="single" w:color="BFBFBF" w:sz="4"/>
+            </w:tcBorders>
+            <w:tcMar>
+              <w:top w:type="dxa" w:w="60"/>
+              <w:left w:type="dxa" w:w="100"/>
+              <w:bottom w:type="dxa" w:w="60"/>
+              <w:right w:type="dxa" w:w="100"/>
+            </w:tcMar>
+          </w:tcPr>
+          <w:p>
+            <w:r>
+              <w:rPr>
+                <w:rFonts w:ascii="Calibri" w:cs="Calibri" w:eastAsia="Calibri" w:hAnsi="Calibri"/>
+                <w:b w:val="false"/>
+                <w:bCs w:val="false"/>
+                <w:sz w:val="20"/>
+                <w:szCs w:val="20"/>
+              </w:rPr>
+              <w:t xml:space="preserve">Nandhakumar A</w:t>
+            </w:r>
+          </w:p>
+        </w:tc>
+        <w:tc>
+          <w:tcPr>
+            <w:tcW w:type="dxa" w:w="4819"/>
+            <w:tcBorders>
+              <w:top w:val="single" w:color="BFBFBF" w:sz="4"/>
+              <w:left w:val="single" w:color="BFBFBF" w:sz="4"/>
+              <w:bottom w:val="single" w:color="BFBFBF" w:sz="4"/>
+              <w:right w:val="single" w:color="BFBFBF" w:sz="4"/>
+            </w:tcBorders>
+            <w:tcMar>
+              <w:top w:type="dxa" w:w="60"/>
+              <w:left w:type="dxa" w:w="100"/>
+              <w:bottom w:type="dxa" w:w="60"/>
+              <w:right w:type="dxa" w:w="100"/>
+            </w:tcMar>
+          </w:tcPr>
+          <w:p>
+            <w:r>
+              <w:rPr>
+                <w:rFonts w:ascii="Calibri" w:cs="Calibri" w:eastAsia="Calibri" w:hAnsi="Calibri"/>
+                <w:b w:val="false"/>
+                <w:bCs w:val="false"/>
+                <w:sz w:val="20"/>
+                <w:szCs w:val="20"/>
+              </w:rPr>
+              <w:t xml:space="preserve">Team Member (Member4)</w:t>
+            </w:r>
+          </w:p>
+        </w:tc>
+      </w:tr>
+      <w:tr>
+        <w:trPr>
+          <w:tblHeader w:val="off"/>
+        </w:trPr>
+        <w:tc>
+          <w:tcPr>
+            <w:tcW w:type="dxa" w:w="4819"/>
+            <w:tcBorders>
+              <w:top w:val="single" w:color="BFBFBF" w:sz="4"/>
+              <w:left w:val="single" w:color="BFBFBF" w:sz="4"/>
+              <w:bottom w:val="single" w:color="BFBFBF" w:sz="4"/>
+              <w:right w:val="single" w:color="BFBFBF" w:sz="4"/>
+            </w:tcBorders>
+            <w:tcMar>
+              <w:top w:type="dxa" w:w="60"/>
+              <w:left w:type="dxa" w:w="100"/>
+              <w:bottom w:type="dxa" w:w="60"/>
+              <w:right w:type="dxa" w:w="100"/>
+            </w:tcMar>
+          </w:tcPr>
+          <w:p>
+            <w:r>
+              <w:rPr>
+                <w:rFonts w:ascii="Calibri" w:cs="Calibri" w:eastAsia="Calibri" w:hAnsi="Calibri"/>
+                <w:b w:val="false"/>
+                <w:bCs w:val="false"/>
+                <w:sz w:val="20"/>
+                <w:szCs w:val="20"/>
+              </w:rPr>
+              <w:t xml:space="preserve">Prakash V</w:t>
+            </w:r>
+          </w:p>
+        </w:tc>
+        <w:tc>
+          <w:tcPr>
+            <w:tcW w:type="dxa" w:w="4819"/>
+            <w:tcBorders>
+              <w:top w:val="single" w:color="BFBFBF" w:sz="4"/>
+              <w:left w:val="single" w:color="BFBFBF" w:sz="4"/>
+              <w:bottom w:val="single" w:color="BFBFBF" w:sz="4"/>
+              <w:right w:val="single" w:color="BFBFBF" w:sz="4"/>
+            </w:tcBorders>
+            <w:tcMar>
+              <w:top w:type="dxa" w:w="60"/>
+              <w:left w:type="dxa" w:w="100"/>
+              <w:bottom w:type="dxa" w:w="60"/>
+              <w:right w:type="dxa" w:w="100"/>
+            </w:tcMar>
+          </w:tcPr>
+          <w:p>
+            <w:r>
+              <w:rPr>
+                <w:rFonts w:ascii="Calibri" w:cs="Calibri" w:eastAsia="Calibri" w:hAnsi="Calibri"/>
+                <w:b w:val="false"/>
+                <w:bCs w:val="false"/>
+                <w:sz w:val="20"/>
+                <w:szCs w:val="20"/>
+              </w:rPr>
+              <w:t xml:space="preserve">Team Member</w:t>
+            </w:r>
+          </w:p>
+        </w:tc>
+      </w:tr>
+    </w:tbl>
     <w:p>
       <w:pPr>
         <w:spacing w:after="120"/>
       </w:pPr>
-      <w:r>
-        <w:rPr>
-          <w:rFonts w:ascii="Calibri" w:cs="Calibri" w:eastAsia="Calibri" w:hAnsi="Calibri"/>
-          <w:sz w:val="22"/>
-          <w:szCs w:val="22"/>
-        </w:rPr>
-        <w:t xml:space="preserve">Developer: </w:t>
-      </w:r>
-      <w:r>
-        <w:rPr>
-          <w:rFonts w:ascii="Calibri" w:cs="Calibri" w:eastAsia="Calibri" w:hAnsi="Calibri"/>
-          <w:b/>
-          <w:bCs/>
-          <w:sz w:val="22"/>
-          <w:szCs w:val="22"/>
-        </w:rPr>
-        <w:t xml:space="preserve">Praveen P</w:t>
-      </w:r>
-      <w:r>
-        <w:rPr>
-          <w:rFonts w:ascii="Calibri" w:cs="Calibri" w:eastAsia="Calibri" w:hAnsi="Calibri"/>
-          <w:sz w:val="22"/>
-          <w:szCs w:val="22"/>
-        </w:rPr>
-        <w:t xml:space="preserve"> (praveen824815@gmail.com). This was delivered as a solo project, so Member1 to Member4 above are all Praveen P.</w:t>
-      </w:r>
     </w:p>
     <w:p>
       <w:pPr>
@@ -8823,7 +9194,7 @@
           <w:sz w:val="22"/>
           <w:szCs w:val="22"/>
         </w:rPr>
-        <w:t xml:space="preserve">: Parcel details</w:t>
+        <w:t xml:space="preserve">: Parcel Details flow in Flow Builder (Active)</w:t>
       </w:r>
     </w:p>
     <w:p>
@@ -9371,7 +9742,7 @@
           <w:sz w:val="22"/>
           <w:szCs w:val="22"/>
         </w:rPr>
-        <w:t xml:space="preserve">Figure 3: Parcel details</w:t>
+        <w:t xml:space="preserve">Figure 3: Parcel Details flow in Flow Builder (Active)</w:t>
       </w:r>
     </w:p>
     <w:p>
@@ -9383,7 +9754,7 @@
           <wp:inline distT="0" distB="0" distL="0" distR="0">
             <wp:extent cx="5715000" cy="2533650"/>
             <wp:effectExtent t="0" r="0" b="0" l="0"/>
-            <wp:docPr id="3" name="03-parcel-details.png" descr="Parcel details" title="Parcel details"/>
+            <wp:docPr id="3" name="03-parcel-details.png" descr="Parcel Details flow in Flow Builder (Active)" title="Parcel Details flow in Flow Builder (Active)"/>
             <wp:cNvGraphicFramePr>
               <a:graphicFrameLocks xmlns:a="http://schemas.openxmlformats.org/drawingml/2006/main" noChangeAspect="1"/>
             </wp:cNvGraphicFramePr>

</xml_diff>

<commit_message>
Add prompt preview screenshot to report; rebuild DOCX and PDF
Co-Authored-By: Claude Sonnet 5.5 <noreply@anthropic.com>
</commit_message>
<xml_diff>
--- a/docs/SwiftShip_Tracker_Project_Report.docx
+++ b/docs/SwiftShip_Tracker_Project_Report.docx
@@ -9221,6 +9221,32 @@
           <w:szCs w:val="22"/>
         </w:rPr>
         <w:t xml:space="preserve">: Retrieve Parcel Details prompt template</w:t>
+      </w:r>
+    </w:p>
+    <w:p>
+      <w:pPr>
+        <w:pStyle w:val="ListParagraph"/>
+        <w:numPr>
+          <w:ilvl w:val="0"/>
+          <w:numId w:val="2"/>
+        </w:numPr>
+        <w:spacing w:after="40"/>
+      </w:pPr>
+      <w:r>
+        <w:rPr>
+          <w:rFonts w:ascii="Consolas" w:cs="Consolas" w:eastAsia="Consolas" w:hAnsi="Consolas"/>
+          <w:sz w:val="20"/>
+          <w:szCs w:val="20"/>
+        </w:rPr>
+        <w:t xml:space="preserve">10-retrieve-parcel-details-book-box.png</w:t>
+      </w:r>
+      <w:r>
+        <w:rPr>
+          <w:rFonts w:ascii="Calibri" w:cs="Calibri" w:eastAsia="Calibri" w:hAnsi="Calibri"/>
+          <w:sz w:val="22"/>
+          <w:szCs w:val="22"/>
+        </w:rPr>
+        <w:t xml:space="preserve">: Prompt Builder preview - the resolved prompt is filled with P-001 (Books Box) data</w:t>
       </w:r>
     </w:p>
     <w:p>
@@ -10205,6 +10231,67 @@
                     <a:xfrm>
                       <a:off x="0" y="0"/>
                       <a:ext cx="5715000" cy="2276475"/>
+                    </a:xfrm>
+                    <a:prstGeom prst="rect">
+                      <a:avLst/>
+                    </a:prstGeom>
+                  </pic:spPr>
+                </pic:pic>
+              </a:graphicData>
+            </a:graphic>
+          </wp:inline>
+        </w:drawing>
+      </w:r>
+    </w:p>
+    <w:p>
+      <w:pPr>
+        <w:keepNext/>
+        <w:spacing w:after="60" w:before="200"/>
+      </w:pPr>
+      <w:r>
+        <w:rPr>
+          <w:rFonts w:ascii="Calibri" w:cs="Calibri" w:eastAsia="Calibri" w:hAnsi="Calibri"/>
+          <w:b/>
+          <w:bCs/>
+          <w:sz w:val="22"/>
+          <w:szCs w:val="22"/>
+        </w:rPr>
+        <w:t xml:space="preserve">Figure 11: Prompt Builder preview: resolved prompt filled with P-001 data</w:t>
+      </w:r>
+    </w:p>
+    <w:p>
+      <w:pPr>
+        <w:spacing w:after="160"/>
+      </w:pPr>
+      <w:r>
+        <w:drawing>
+          <wp:inline distT="0" distB="0" distL="0" distR="0">
+            <wp:extent cx="5715000" cy="2533650"/>
+            <wp:effectExtent t="0" r="0" b="0" l="0"/>
+            <wp:docPr id="11" name="10-retrieve-parcel-details-book-box.png" descr="Prompt Builder preview: resolved prompt filled with P-001 data" title="Prompt Builder preview: resolved prompt filled with P-001 data"/>
+            <wp:cNvGraphicFramePr>
+              <a:graphicFrameLocks xmlns:a="http://schemas.openxmlformats.org/drawingml/2006/main" noChangeAspect="1"/>
+            </wp:cNvGraphicFramePr>
+            <a:graphic xmlns:a="http://schemas.openxmlformats.org/drawingml/2006/main">
+              <a:graphicData uri="http://schemas.openxmlformats.org/drawingml/2006/picture">
+                <pic:pic xmlns:pic="http://schemas.openxmlformats.org/drawingml/2006/picture">
+                  <pic:nvPicPr>
+                    <pic:cNvPr id="0" name="" descr=""/>
+                    <pic:cNvPicPr>
+                      <a:picLocks noChangeAspect="1" noChangeArrowheads="1"/>
+                    </pic:cNvPicPr>
+                  </pic:nvPicPr>
+                  <pic:blipFill>
+                    <a:blip r:embed="rId17" cstate="none"/>
+                    <a:srcRect/>
+                    <a:stretch>
+                      <a:fillRect/>
+                    </a:stretch>
+                  </pic:blipFill>
+                  <pic:spPr bwMode="auto">
+                    <a:xfrm>
+                      <a:off x="0" y="0"/>
+                      <a:ext cx="5715000" cy="2533650"/>
                     </a:xfrm>
                     <a:prstGeom prst="rect">
                       <a:avLst/>

</xml_diff>

<commit_message>
Fix and activate Retrieve Parcel Details prompt template (v2); update evidence and report
Co-Authored-By: Claude Sonnet 5.5 <noreply@anthropic.com>
</commit_message>
<xml_diff>
--- a/docs/SwiftShip_Tracker_Project_Report.docx
+++ b/docs/SwiftShip_Tracker_Project_Report.docx
@@ -9246,7 +9246,23 @@
           <w:sz w:val="22"/>
           <w:szCs w:val="22"/>
         </w:rPr>
-        <w:t xml:space="preserve">: Prompt Builder preview - the resolved prompt is filled with P-001 (Books Box) data</w:t>
+        <w:t xml:space="preserve">: Prompt Builder preview of Version 1 (resolved prompt filled with P-001 data). Version 1 was later replaced by the active Version 2, whose correct output is in </w:t>
+      </w:r>
+      <w:r>
+        <w:rPr>
+          <w:rFonts w:ascii="Consolas" w:cs="Consolas" w:eastAsia="Consolas" w:hAnsi="Consolas"/>
+          <w:sz w:val="20"/>
+          <w:szCs w:val="20"/>
+        </w:rPr>
+        <w:t xml:space="preserve">docs/test-evidence.md</w:t>
+      </w:r>
+      <w:r>
+        <w:rPr>
+          <w:rFonts w:ascii="Calibri" w:cs="Calibri" w:eastAsia="Calibri" w:hAnsi="Calibri"/>
+          <w:sz w:val="22"/>
+          <w:szCs w:val="22"/>
+        </w:rPr>
+        <w:t xml:space="preserve"> section 7.</w:t>
       </w:r>
     </w:p>
     <w:p>

</xml_diff>